<commit_message>
feat(search): implement quiescence search and noisy move generation
1.Added quiescence search at leaf nodes to reduce horizon effect and improve tactical evaluation stability.

2.Integrated alpha-beta pruning into quiescence search using stand-pat evaluation and capture + promotion only search extensions and move ordering through existing MVV-LVA table.

3.Refactored move generation to support capture-only ("noisy move") generation through a capturesOnly parameter.
Preserved existing move generation behavior through default parameter values to avoid changes to normal search code paths.

4.Added documentation covering:
.Quiescence search implementation details
.Capture-only move generation changes
.Test results and observations
</commit_message>
<xml_diff>
--- a/Documentation/DOCUMENTATION.docx
+++ b/Documentation/DOCUMENTATION.docx
@@ -45,47 +45,11 @@
         </w:rPr>
         <w:t xml:space="preserve">Starting Position – </w:t>
       </w:r>
-      <w:proofErr w:type="spellStart"/>
-      <w:r>
-        <w:rPr>
-          <w:lang w:val="en-US"/>
-        </w:rPr>
-        <w:t>rnbqkbnr</w:t>
-      </w:r>
-      <w:proofErr w:type="spellEnd"/>
-      <w:r>
-        <w:rPr>
-          <w:lang w:val="en-US"/>
-        </w:rPr>
-        <w:t>/</w:t>
-      </w:r>
-      <w:proofErr w:type="spellStart"/>
-      <w:r>
-        <w:rPr>
-          <w:lang w:val="en-US"/>
-        </w:rPr>
-        <w:t>pppppppp</w:t>
-      </w:r>
-      <w:proofErr w:type="spellEnd"/>
-      <w:r>
-        <w:rPr>
-          <w:lang w:val="en-US"/>
-        </w:rPr>
-        <w:t xml:space="preserve">/8/8/8/8/PPPPPPPP/RNBQKBNR w </w:t>
-      </w:r>
-      <w:proofErr w:type="spellStart"/>
-      <w:r>
-        <w:rPr>
-          <w:lang w:val="en-US"/>
-        </w:rPr>
-        <w:t>KQkq</w:t>
-      </w:r>
-      <w:proofErr w:type="spellEnd"/>
-      <w:r>
-        <w:rPr>
-          <w:lang w:val="en-US"/>
-        </w:rPr>
-        <w:t xml:space="preserve"> - 0 1</w:t>
+      <w:r>
+        <w:rPr>
+          <w:lang w:val="en-US"/>
+        </w:rPr>
+        <w:t>rnbqkbnr/pppppppp/8/8/8/8/PPPPPPPP/RNBQKBNR w KQkq - 0 1</w:t>
       </w:r>
     </w:p>
     <w:p>
@@ -346,21 +310,7 @@
         <w:rPr>
           <w:lang w:val="en-US"/>
         </w:rPr>
-        <w:t xml:space="preserve">r3r1k1/1bpp1p1p/p2b1q2/1p1npnN1/B2PP3/1PN1B3/P1PQ1PPP/R3R1K1 b </w:t>
-      </w:r>
-      <w:proofErr w:type="spellStart"/>
-      <w:r>
-        <w:rPr>
-          <w:lang w:val="en-US"/>
-        </w:rPr>
-        <w:t>KQkq</w:t>
-      </w:r>
-      <w:proofErr w:type="spellEnd"/>
-      <w:r>
-        <w:rPr>
-          <w:lang w:val="en-US"/>
-        </w:rPr>
-        <w:t xml:space="preserve"> - 0 1</w:t>
+        <w:t>r3r1k1/1bpp1p1p/p2b1q2/1p1npnN1/B2PP3/1PN1B3/P1PQ1PPP/R3R1K1 b KQkq - 0 1</w:t>
       </w:r>
     </w:p>
     <w:p>
@@ -610,21 +560,7 @@
         <w:rPr>
           <w:lang w:val="en-US"/>
         </w:rPr>
-        <w:t xml:space="preserve">r3k2r/Pppp1ppp/1b3nbN/nP6/BBP1P3/q4N2/Pp1P2PP/R2Q1RK1 w </w:t>
-      </w:r>
-      <w:proofErr w:type="spellStart"/>
-      <w:r>
-        <w:rPr>
-          <w:lang w:val="en-US"/>
-        </w:rPr>
-        <w:t>kq</w:t>
-      </w:r>
-      <w:proofErr w:type="spellEnd"/>
-      <w:r>
-        <w:rPr>
-          <w:lang w:val="en-US"/>
-        </w:rPr>
-        <w:t xml:space="preserve"> - 0 1</w:t>
+        <w:t>r3k2r/Pppp1ppp/1b3nbN/nP6/BBP1P3/q4N2/Pp1P2PP/R2Q1RK1 w kq - 0 1</w:t>
       </w:r>
     </w:p>
     <w:p>
@@ -792,21 +728,7 @@
         <w:rPr>
           <w:lang w:val="en-US"/>
         </w:rPr>
-        <w:t xml:space="preserve">r3k2r/p1ppqpb1/bn2pnp1/3PN3/1p2P3/2N2Q1p/PPPBBPPP/R3K2R w </w:t>
-      </w:r>
-      <w:proofErr w:type="spellStart"/>
-      <w:r>
-        <w:rPr>
-          <w:lang w:val="en-US"/>
-        </w:rPr>
-        <w:t>KQkq</w:t>
-      </w:r>
-      <w:proofErr w:type="spellEnd"/>
-      <w:r>
-        <w:rPr>
-          <w:lang w:val="en-US"/>
-        </w:rPr>
-        <w:t xml:space="preserve"> </w:t>
+        <w:t xml:space="preserve">r3k2r/p1ppqpb1/bn2pnp1/3PN3/1p2P3/2N2Q1p/PPPBBPPP/R3K2R w KQkq </w:t>
       </w:r>
       <w:r>
         <w:rPr>
@@ -4305,6 +4227,1507 @@
         </w:rPr>
       </w:pPr>
     </w:p>
+    <w:p>
+      <w:pPr>
+        <w:rPr>
+          <w:lang w:val="en-US"/>
+        </w:rPr>
+      </w:pPr>
+      <w:r>
+        <w:rPr>
+          <w:lang w:val="en-US"/>
+        </w:rPr>
+        <w:t>QUIESCENCE SEARCH</w:t>
+      </w:r>
+    </w:p>
+    <w:tbl>
+      <w:tblPr>
+        <w:tblStyle w:val="TableGrid"/>
+        <w:tblW w:w="9355" w:type="dxa"/>
+        <w:tblLook w:val="04A0" w:firstRow="1" w:lastRow="0" w:firstColumn="1" w:lastColumn="0" w:noHBand="0" w:noVBand="1"/>
+      </w:tblPr>
+      <w:tblGrid>
+        <w:gridCol w:w="1307"/>
+        <w:gridCol w:w="816"/>
+        <w:gridCol w:w="1022"/>
+        <w:gridCol w:w="1260"/>
+        <w:gridCol w:w="1080"/>
+        <w:gridCol w:w="1080"/>
+        <w:gridCol w:w="1530"/>
+        <w:gridCol w:w="1260"/>
+      </w:tblGrid>
+      <w:tr>
+        <w:tc>
+          <w:tcPr>
+            <w:tcW w:w="1307" w:type="dxa"/>
+          </w:tcPr>
+          <w:p>
+            <w:pPr>
+              <w:rPr>
+                <w:lang w:val="en-US"/>
+              </w:rPr>
+            </w:pPr>
+            <w:r>
+              <w:rPr>
+                <w:lang w:val="en-US"/>
+              </w:rPr>
+              <w:t>POSITION</w:t>
+            </w:r>
+          </w:p>
+        </w:tc>
+        <w:tc>
+          <w:tcPr>
+            <w:tcW w:w="816" w:type="dxa"/>
+          </w:tcPr>
+          <w:p>
+            <w:pPr>
+              <w:rPr>
+                <w:lang w:val="en-US"/>
+              </w:rPr>
+            </w:pPr>
+            <w:r>
+              <w:rPr>
+                <w:lang w:val="en-US"/>
+              </w:rPr>
+              <w:t>DEPTH</w:t>
+            </w:r>
+          </w:p>
+        </w:tc>
+        <w:tc>
+          <w:tcPr>
+            <w:tcW w:w="1022" w:type="dxa"/>
+          </w:tcPr>
+          <w:p>
+            <w:pPr>
+              <w:rPr>
+                <w:lang w:val="en-US"/>
+              </w:rPr>
+            </w:pPr>
+            <w:r>
+              <w:rPr>
+                <w:lang w:val="en-US"/>
+              </w:rPr>
+              <w:t>TOTAL NODES BEFORE</w:t>
+            </w:r>
+          </w:p>
+        </w:tc>
+        <w:tc>
+          <w:tcPr>
+            <w:tcW w:w="1260" w:type="dxa"/>
+          </w:tcPr>
+          <w:p>
+            <w:pPr>
+              <w:rPr>
+                <w:lang w:val="en-US"/>
+              </w:rPr>
+            </w:pPr>
+            <w:r>
+              <w:rPr>
+                <w:lang w:val="en-US"/>
+              </w:rPr>
+              <w:t>TOTAL NODES AFTER</w:t>
+            </w:r>
+          </w:p>
+        </w:tc>
+        <w:tc>
+          <w:tcPr>
+            <w:tcW w:w="1080" w:type="dxa"/>
+          </w:tcPr>
+          <w:p>
+            <w:pPr>
+              <w:rPr>
+                <w:lang w:val="en-US"/>
+              </w:rPr>
+            </w:pPr>
+            <w:r>
+              <w:rPr>
+                <w:lang w:val="en-US"/>
+              </w:rPr>
+              <w:t>TIME (ms) BEFORE</w:t>
+            </w:r>
+          </w:p>
+        </w:tc>
+        <w:tc>
+          <w:tcPr>
+            <w:tcW w:w="1080" w:type="dxa"/>
+          </w:tcPr>
+          <w:p>
+            <w:pPr>
+              <w:rPr>
+                <w:lang w:val="en-US"/>
+              </w:rPr>
+            </w:pPr>
+            <w:r>
+              <w:rPr>
+                <w:lang w:val="en-US"/>
+              </w:rPr>
+              <w:t>TIME (ms) AFTER</w:t>
+            </w:r>
+          </w:p>
+        </w:tc>
+        <w:tc>
+          <w:tcPr>
+            <w:tcW w:w="1530" w:type="dxa"/>
+          </w:tcPr>
+          <w:p>
+            <w:pPr>
+              <w:rPr>
+                <w:lang w:val="en-US"/>
+              </w:rPr>
+            </w:pPr>
+            <w:r>
+              <w:rPr>
+                <w:lang w:val="en-US"/>
+              </w:rPr>
+              <w:t>ENGINE LINE BEFORE</w:t>
+            </w:r>
+          </w:p>
+        </w:tc>
+        <w:tc>
+          <w:tcPr>
+            <w:tcW w:w="1260" w:type="dxa"/>
+          </w:tcPr>
+          <w:p>
+            <w:pPr>
+              <w:rPr>
+                <w:lang w:val="en-US"/>
+              </w:rPr>
+            </w:pPr>
+            <w:r>
+              <w:rPr>
+                <w:lang w:val="en-US"/>
+              </w:rPr>
+              <w:t>ENGINE LINE AFTER</w:t>
+            </w:r>
+          </w:p>
+        </w:tc>
+      </w:tr>
+      <w:tr>
+        <w:tc>
+          <w:tcPr>
+            <w:tcW w:w="1307" w:type="dxa"/>
+          </w:tcPr>
+          <w:p>
+            <w:pPr>
+              <w:rPr>
+                <w:lang w:val="en-US"/>
+              </w:rPr>
+            </w:pPr>
+            <w:r>
+              <w:rPr>
+                <w:lang w:val="en-US"/>
+              </w:rPr>
+              <w:t>End Game</w:t>
+            </w:r>
+          </w:p>
+        </w:tc>
+        <w:tc>
+          <w:tcPr>
+            <w:tcW w:w="816" w:type="dxa"/>
+          </w:tcPr>
+          <w:p>
+            <w:pPr>
+              <w:rPr>
+                <w:lang w:val="en-US"/>
+              </w:rPr>
+            </w:pPr>
+            <w:r>
+              <w:rPr>
+                <w:lang w:val="en-US"/>
+              </w:rPr>
+              <w:t>2</w:t>
+            </w:r>
+          </w:p>
+        </w:tc>
+        <w:tc>
+          <w:tcPr>
+            <w:tcW w:w="1022" w:type="dxa"/>
+          </w:tcPr>
+          <w:p>
+            <w:pPr>
+              <w:rPr>
+                <w:lang w:val="en-US"/>
+              </w:rPr>
+            </w:pPr>
+            <w:r>
+              <w:rPr>
+                <w:lang w:val="en-US"/>
+              </w:rPr>
+              <w:t>93</w:t>
+            </w:r>
+          </w:p>
+        </w:tc>
+        <w:tc>
+          <w:tcPr>
+            <w:tcW w:w="1260" w:type="dxa"/>
+          </w:tcPr>
+          <w:p>
+            <w:pPr>
+              <w:rPr>
+                <w:lang w:val="en-US"/>
+              </w:rPr>
+            </w:pPr>
+            <w:r>
+              <w:rPr>
+                <w:lang w:val="en-US"/>
+              </w:rPr>
+              <w:t>145</w:t>
+            </w:r>
+          </w:p>
+        </w:tc>
+        <w:tc>
+          <w:tcPr>
+            <w:tcW w:w="1080" w:type="dxa"/>
+          </w:tcPr>
+          <w:p>
+            <w:pPr>
+              <w:rPr>
+                <w:lang w:val="en-US"/>
+              </w:rPr>
+            </w:pPr>
+            <w:r>
+              <w:rPr>
+                <w:lang w:val="en-US"/>
+              </w:rPr>
+              <w:t>26.57</w:t>
+            </w:r>
+          </w:p>
+        </w:tc>
+        <w:tc>
+          <w:tcPr>
+            <w:tcW w:w="1080" w:type="dxa"/>
+          </w:tcPr>
+          <w:p>
+            <w:pPr>
+              <w:rPr>
+                <w:lang w:val="en-US"/>
+              </w:rPr>
+            </w:pPr>
+            <w:r>
+              <w:rPr>
+                <w:lang w:val="en-US"/>
+              </w:rPr>
+              <w:t>27.17</w:t>
+            </w:r>
+          </w:p>
+        </w:tc>
+        <w:tc>
+          <w:tcPr>
+            <w:tcW w:w="1530" w:type="dxa"/>
+          </w:tcPr>
+          <w:p>
+            <w:pPr>
+              <w:rPr>
+                <w:lang w:val="en-US"/>
+              </w:rPr>
+            </w:pPr>
+            <w:r>
+              <w:rPr>
+                <w:lang w:val="en-US"/>
+              </w:rPr>
+              <w:t>c6b5</w:t>
+            </w:r>
+            <w:r>
+              <w:rPr>
+                <w:lang w:val="en-US"/>
+              </w:rPr>
+              <w:t xml:space="preserve">, </w:t>
+            </w:r>
+            <w:r>
+              <w:rPr>
+                <w:lang w:val="en-US"/>
+              </w:rPr>
+              <w:t>f8b4</w:t>
+            </w:r>
+          </w:p>
+        </w:tc>
+        <w:tc>
+          <w:tcPr>
+            <w:tcW w:w="1260" w:type="dxa"/>
+          </w:tcPr>
+          <w:p>
+            <w:pPr>
+              <w:rPr>
+                <w:lang w:val="en-US"/>
+              </w:rPr>
+            </w:pPr>
+            <w:r>
+              <w:rPr>
+                <w:lang w:val="en-US"/>
+              </w:rPr>
+              <w:t>a6a8</w:t>
+            </w:r>
+            <w:r>
+              <w:rPr>
+                <w:lang w:val="en-US"/>
+              </w:rPr>
+              <w:t>,</w:t>
+            </w:r>
+            <w:r>
+              <w:rPr>
+                <w:lang w:val="en-US"/>
+              </w:rPr>
+              <w:t xml:space="preserve"> f8a8</w:t>
+            </w:r>
+          </w:p>
+        </w:tc>
+      </w:tr>
+      <w:tr>
+        <w:tc>
+          <w:tcPr>
+            <w:tcW w:w="1307" w:type="dxa"/>
+          </w:tcPr>
+          <w:p>
+            <w:pPr>
+              <w:rPr>
+                <w:lang w:val="en-US"/>
+              </w:rPr>
+            </w:pPr>
+            <w:r>
+              <w:rPr>
+                <w:lang w:val="en-US"/>
+              </w:rPr>
+              <w:t>End Game</w:t>
+            </w:r>
+          </w:p>
+        </w:tc>
+        <w:tc>
+          <w:tcPr>
+            <w:tcW w:w="816" w:type="dxa"/>
+          </w:tcPr>
+          <w:p>
+            <w:pPr>
+              <w:rPr>
+                <w:lang w:val="en-US"/>
+              </w:rPr>
+            </w:pPr>
+            <w:r>
+              <w:rPr>
+                <w:lang w:val="en-US"/>
+              </w:rPr>
+              <w:t>3</w:t>
+            </w:r>
+          </w:p>
+        </w:tc>
+        <w:tc>
+          <w:tcPr>
+            <w:tcW w:w="1022" w:type="dxa"/>
+          </w:tcPr>
+          <w:p>
+            <w:pPr>
+              <w:rPr>
+                <w:lang w:val="en-US"/>
+              </w:rPr>
+            </w:pPr>
+            <w:r>
+              <w:rPr>
+                <w:lang w:val="en-US"/>
+              </w:rPr>
+              <w:t>1800</w:t>
+            </w:r>
+          </w:p>
+        </w:tc>
+        <w:tc>
+          <w:tcPr>
+            <w:tcW w:w="1260" w:type="dxa"/>
+          </w:tcPr>
+          <w:p>
+            <w:pPr>
+              <w:rPr>
+                <w:lang w:val="en-US"/>
+              </w:rPr>
+            </w:pPr>
+            <w:r>
+              <w:rPr>
+                <w:lang w:val="en-US"/>
+              </w:rPr>
+              <w:t>1859</w:t>
+            </w:r>
+          </w:p>
+        </w:tc>
+        <w:tc>
+          <w:tcPr>
+            <w:tcW w:w="1080" w:type="dxa"/>
+          </w:tcPr>
+          <w:p>
+            <w:pPr>
+              <w:rPr>
+                <w:lang w:val="en-US"/>
+              </w:rPr>
+            </w:pPr>
+            <w:r>
+              <w:rPr>
+                <w:lang w:val="en-US"/>
+              </w:rPr>
+              <w:t>29.</w:t>
+            </w:r>
+            <w:r>
+              <w:rPr>
+                <w:lang w:val="en-US"/>
+              </w:rPr>
+              <w:t>78</w:t>
+            </w:r>
+          </w:p>
+        </w:tc>
+        <w:tc>
+          <w:tcPr>
+            <w:tcW w:w="1080" w:type="dxa"/>
+          </w:tcPr>
+          <w:p>
+            <w:pPr>
+              <w:rPr>
+                <w:lang w:val="en-US"/>
+              </w:rPr>
+            </w:pPr>
+            <w:r>
+              <w:rPr>
+                <w:lang w:val="en-US"/>
+              </w:rPr>
+              <w:t>28.83</w:t>
+            </w:r>
+          </w:p>
+        </w:tc>
+        <w:tc>
+          <w:tcPr>
+            <w:tcW w:w="1530" w:type="dxa"/>
+          </w:tcPr>
+          <w:p>
+            <w:pPr>
+              <w:rPr>
+                <w:lang w:val="en-US"/>
+              </w:rPr>
+            </w:pPr>
+            <w:r>
+              <w:rPr>
+                <w:lang w:val="en-US"/>
+              </w:rPr>
+              <w:t>a6a8</w:t>
+            </w:r>
+            <w:r>
+              <w:rPr>
+                <w:lang w:val="en-US"/>
+              </w:rPr>
+              <w:t>,</w:t>
+            </w:r>
+            <w:r>
+              <w:rPr>
+                <w:lang w:val="en-US"/>
+              </w:rPr>
+              <w:t xml:space="preserve"> f8a8</w:t>
+            </w:r>
+            <w:r>
+              <w:rPr>
+                <w:lang w:val="en-US"/>
+              </w:rPr>
+              <w:t>,</w:t>
+            </w:r>
+            <w:r>
+              <w:rPr>
+                <w:lang w:val="en-US"/>
+              </w:rPr>
+              <w:t xml:space="preserve"> c6a8</w:t>
+            </w:r>
+          </w:p>
+        </w:tc>
+        <w:tc>
+          <w:tcPr>
+            <w:tcW w:w="1260" w:type="dxa"/>
+          </w:tcPr>
+          <w:p>
+            <w:pPr>
+              <w:rPr>
+                <w:lang w:val="en-US"/>
+              </w:rPr>
+            </w:pPr>
+            <w:r>
+              <w:rPr>
+                <w:lang w:val="en-US"/>
+              </w:rPr>
+              <w:t>a6a8</w:t>
+            </w:r>
+            <w:r>
+              <w:rPr>
+                <w:lang w:val="en-US"/>
+              </w:rPr>
+              <w:t xml:space="preserve">, </w:t>
+            </w:r>
+            <w:r>
+              <w:rPr>
+                <w:lang w:val="en-US"/>
+              </w:rPr>
+              <w:t>f8a8</w:t>
+            </w:r>
+            <w:r>
+              <w:rPr>
+                <w:lang w:val="en-US"/>
+              </w:rPr>
+              <w:t>,</w:t>
+            </w:r>
+            <w:r>
+              <w:rPr>
+                <w:lang w:val="en-US"/>
+              </w:rPr>
+              <w:t xml:space="preserve"> c6a8</w:t>
+            </w:r>
+          </w:p>
+        </w:tc>
+      </w:tr>
+    </w:tbl>
+    <w:p>
+      <w:pPr>
+        <w:rPr>
+          <w:sz w:val="20"/>
+          <w:szCs w:val="20"/>
+        </w:rPr>
+      </w:pPr>
+      <w:r>
+        <w:rPr>
+          <w:sz w:val="20"/>
+          <w:szCs w:val="20"/>
+        </w:rPr>
+        <w:t xml:space="preserve">Missed pinning the rook on a6 to queen on f8 on depth </w:t>
+      </w:r>
+      <w:r>
+        <w:rPr>
+          <w:sz w:val="20"/>
+          <w:szCs w:val="20"/>
+        </w:rPr>
+        <w:t>2</w:t>
+      </w:r>
+      <w:r>
+        <w:rPr>
+          <w:sz w:val="20"/>
+          <w:szCs w:val="20"/>
+        </w:rPr>
+        <w:t xml:space="preserve"> without quiescence search</w:t>
+      </w:r>
+      <w:r>
+        <w:rPr>
+          <w:sz w:val="20"/>
+          <w:szCs w:val="20"/>
+        </w:rPr>
+        <w:t xml:space="preserve"> with negligible time and node count increase.</w:t>
+      </w:r>
+    </w:p>
+    <w:p>
+      <w:pPr>
+        <w:rPr>
+          <w:lang w:val="en-US"/>
+        </w:rPr>
+      </w:pPr>
+    </w:p>
+    <w:p>
+      <w:pPr>
+        <w:rPr>
+          <w:lang w:val="en-US"/>
+        </w:rPr>
+      </w:pPr>
+    </w:p>
+    <w:p>
+      <w:pPr>
+        <w:rPr>
+          <w:lang w:val="en-US"/>
+        </w:rPr>
+      </w:pPr>
+      <w:r>
+        <w:rPr>
+          <w:lang w:val="en-US"/>
+        </w:rPr>
+        <w:lastRenderedPageBreak/>
+        <w:t>Observed gameplay changes –</w:t>
+      </w:r>
+    </w:p>
+    <w:p>
+      <w:pPr>
+        <w:pStyle w:val="ListParagraph"/>
+        <w:numPr>
+          <w:ilvl w:val="0"/>
+          <w:numId w:val="12"/>
+        </w:numPr>
+        <w:rPr>
+          <w:sz w:val="18"/>
+          <w:szCs w:val="18"/>
+          <w:lang w:val="en-US"/>
+        </w:rPr>
+      </w:pPr>
+      <w:r>
+        <w:rPr>
+          <w:sz w:val="18"/>
+          <w:szCs w:val="18"/>
+          <w:lang w:val="en-US"/>
+        </w:rPr>
+        <w:t>Before Quiescence</w:t>
+      </w:r>
+    </w:p>
+    <w:p>
+      <w:pPr>
+        <w:pStyle w:val="ListParagraph"/>
+        <w:numPr>
+          <w:ilvl w:val="1"/>
+          <w:numId w:val="12"/>
+        </w:numPr>
+        <w:rPr>
+          <w:sz w:val="18"/>
+          <w:szCs w:val="18"/>
+          <w:lang w:val="en-US"/>
+        </w:rPr>
+      </w:pPr>
+      <w:r>
+        <w:rPr>
+          <w:sz w:val="18"/>
+          <w:szCs w:val="18"/>
+          <w:lang w:val="en-US"/>
+        </w:rPr>
+        <w:t xml:space="preserve">The engine frequently performed questionable opening exchanges. </w:t>
+      </w:r>
+    </w:p>
+    <w:p>
+      <w:pPr>
+        <w:pStyle w:val="ListParagraph"/>
+        <w:numPr>
+          <w:ilvl w:val="1"/>
+          <w:numId w:val="12"/>
+        </w:numPr>
+        <w:rPr>
+          <w:sz w:val="18"/>
+          <w:szCs w:val="18"/>
+          <w:lang w:val="en-US"/>
+        </w:rPr>
+      </w:pPr>
+      <w:r>
+        <w:rPr>
+          <w:sz w:val="18"/>
+          <w:szCs w:val="18"/>
+          <w:lang w:val="en-US"/>
+        </w:rPr>
+        <w:t xml:space="preserve">Pieces, particularly knights, would sometimes make multiple consecutive maneuvers to occupy central squares despite immediate tactical drawbacks. </w:t>
+      </w:r>
+    </w:p>
+    <w:p>
+      <w:pPr>
+        <w:pStyle w:val="ListParagraph"/>
+        <w:numPr>
+          <w:ilvl w:val="1"/>
+          <w:numId w:val="12"/>
+        </w:numPr>
+        <w:rPr>
+          <w:sz w:val="18"/>
+          <w:szCs w:val="18"/>
+          <w:lang w:val="en-US"/>
+        </w:rPr>
+      </w:pPr>
+      <w:r>
+        <w:rPr>
+          <w:sz w:val="18"/>
+          <w:szCs w:val="18"/>
+          <w:lang w:val="en-US"/>
+        </w:rPr>
+        <w:t>Static evaluation bonuses occasionally outweighed tactical considerations at the search horizon.</w:t>
+      </w:r>
+    </w:p>
+    <w:p>
+      <w:pPr>
+        <w:pStyle w:val="ListParagraph"/>
+        <w:numPr>
+          <w:ilvl w:val="0"/>
+          <w:numId w:val="12"/>
+        </w:numPr>
+        <w:rPr>
+          <w:sz w:val="18"/>
+          <w:szCs w:val="18"/>
+          <w:lang w:val="en-US"/>
+        </w:rPr>
+      </w:pPr>
+      <w:r>
+        <w:rPr>
+          <w:sz w:val="18"/>
+          <w:szCs w:val="18"/>
+          <w:lang w:val="en-US"/>
+        </w:rPr>
+        <w:t>After Quiescence</w:t>
+      </w:r>
+    </w:p>
+    <w:p>
+      <w:pPr>
+        <w:pStyle w:val="ListParagraph"/>
+        <w:numPr>
+          <w:ilvl w:val="1"/>
+          <w:numId w:val="12"/>
+        </w:numPr>
+        <w:rPr>
+          <w:sz w:val="18"/>
+          <w:szCs w:val="18"/>
+          <w:lang w:val="en-US"/>
+        </w:rPr>
+      </w:pPr>
+      <w:r>
+        <w:rPr>
+          <w:sz w:val="18"/>
+          <w:szCs w:val="18"/>
+          <w:lang w:val="en-US"/>
+        </w:rPr>
+        <w:t xml:space="preserve">Opening play became noticeably more stable. </w:t>
+      </w:r>
+    </w:p>
+    <w:p>
+      <w:pPr>
+        <w:pStyle w:val="ListParagraph"/>
+        <w:numPr>
+          <w:ilvl w:val="1"/>
+          <w:numId w:val="12"/>
+        </w:numPr>
+        <w:rPr>
+          <w:sz w:val="18"/>
+          <w:szCs w:val="18"/>
+          <w:lang w:val="en-US"/>
+        </w:rPr>
+      </w:pPr>
+      <w:r>
+        <w:rPr>
+          <w:sz w:val="18"/>
+          <w:szCs w:val="18"/>
+          <w:lang w:val="en-US"/>
+        </w:rPr>
+        <w:t xml:space="preserve">The engine became less willing to enter unfavorable exchanges. </w:t>
+      </w:r>
+    </w:p>
+    <w:p>
+      <w:pPr>
+        <w:pStyle w:val="ListParagraph"/>
+        <w:numPr>
+          <w:ilvl w:val="1"/>
+          <w:numId w:val="12"/>
+        </w:numPr>
+        <w:rPr>
+          <w:sz w:val="18"/>
+          <w:szCs w:val="18"/>
+          <w:lang w:val="en-US"/>
+        </w:rPr>
+      </w:pPr>
+      <w:r>
+        <w:rPr>
+          <w:sz w:val="18"/>
+          <w:szCs w:val="18"/>
+          <w:lang w:val="en-US"/>
+        </w:rPr>
+        <w:t>Tactical responses involving captures were considered before evaluating leaf nodes, reducing short-sighted decisions caused by the horizon effect.</w:t>
+      </w:r>
+    </w:p>
+    <w:p>
+      <w:pPr>
+        <w:pStyle w:val="ListParagraph"/>
+        <w:rPr>
+          <w:sz w:val="18"/>
+          <w:szCs w:val="18"/>
+          <w:lang w:val="en-US"/>
+        </w:rPr>
+      </w:pPr>
+    </w:p>
+    <w:p>
+      <w:pPr>
+        <w:pStyle w:val="ListParagraph"/>
+        <w:rPr>
+          <w:sz w:val="18"/>
+          <w:szCs w:val="18"/>
+          <w:lang w:val="en-US"/>
+        </w:rPr>
+      </w:pPr>
+      <w:r>
+        <w:rPr>
+          <w:noProof/>
+          <w:lang w:val="en-US"/>
+        </w:rPr>
+        <mc:AlternateContent>
+          <mc:Choice Requires="wps">
+            <w:drawing>
+              <wp:anchor distT="0" distB="0" distL="114300" distR="114300" simplePos="0" relativeHeight="251671552" behindDoc="0" locked="0" layoutInCell="1" allowOverlap="1" wp14:anchorId="1A478A7F" wp14:editId="73DD86D6">
+                <wp:simplePos x="0" y="0"/>
+                <wp:positionH relativeFrom="margin">
+                  <wp:posOffset>3543704</wp:posOffset>
+                </wp:positionH>
+                <wp:positionV relativeFrom="paragraph">
+                  <wp:posOffset>144780</wp:posOffset>
+                </wp:positionV>
+                <wp:extent cx="2273935" cy="2172970"/>
+                <wp:effectExtent l="0" t="0" r="0" b="0"/>
+                <wp:wrapNone/>
+                <wp:docPr id="78777655" name="Rectangle 1"/>
+                <wp:cNvGraphicFramePr/>
+                <a:graphic xmlns:a="http://schemas.openxmlformats.org/drawingml/2006/main">
+                  <a:graphicData uri="http://schemas.microsoft.com/office/word/2010/wordprocessingShape">
+                    <wps:wsp>
+                      <wps:cNvSpPr/>
+                      <wps:spPr>
+                        <a:xfrm>
+                          <a:off x="0" y="0"/>
+                          <a:ext cx="2273935" cy="2172970"/>
+                        </a:xfrm>
+                        <a:prstGeom prst="rect">
+                          <a:avLst/>
+                        </a:prstGeom>
+                        <a:blipFill>
+                          <a:blip r:embed="rId15" cstate="print">
+                            <a:extLst>
+                              <a:ext uri="{28A0092B-C50C-407E-A947-70E740481C1C}">
+                                <a14:useLocalDpi xmlns:a14="http://schemas.microsoft.com/office/drawing/2010/main" val="0"/>
+                              </a:ext>
+                            </a:extLst>
+                          </a:blip>
+                          <a:stretch>
+                            <a:fillRect/>
+                          </a:stretch>
+                        </a:blipFill>
+                        <a:ln>
+                          <a:noFill/>
+                        </a:ln>
+                      </wps:spPr>
+                      <wps:style>
+                        <a:lnRef idx="2">
+                          <a:schemeClr val="accent1">
+                            <a:shade val="15000"/>
+                          </a:schemeClr>
+                        </a:lnRef>
+                        <a:fillRef idx="1">
+                          <a:schemeClr val="accent1"/>
+                        </a:fillRef>
+                        <a:effectRef idx="0">
+                          <a:schemeClr val="accent1"/>
+                        </a:effectRef>
+                        <a:fontRef idx="minor">
+                          <a:schemeClr val="lt1"/>
+                        </a:fontRef>
+                      </wps:style>
+                      <wps:bodyPr rot="0" spcFirstLastPara="0" vertOverflow="overflow" horzOverflow="overflow" vert="horz" wrap="square" lIns="91440" tIns="45720" rIns="91440" bIns="45720" numCol="1" spcCol="0" rtlCol="0" fromWordArt="0" anchor="ctr" anchorCtr="0" forceAA="0" compatLnSpc="1">
+                        <a:prstTxWarp prst="textNoShape">
+                          <a:avLst/>
+                        </a:prstTxWarp>
+                        <a:noAutofit/>
+                      </wps:bodyPr>
+                    </wps:wsp>
+                  </a:graphicData>
+                </a:graphic>
+                <wp14:sizeRelH relativeFrom="margin">
+                  <wp14:pctWidth>0</wp14:pctWidth>
+                </wp14:sizeRelH>
+                <wp14:sizeRelV relativeFrom="margin">
+                  <wp14:pctHeight>0</wp14:pctHeight>
+                </wp14:sizeRelV>
+              </wp:anchor>
+            </w:drawing>
+          </mc:Choice>
+          <mc:Fallback>
+            <w:pict>
+              <v:rect w14:anchorId="3425C200" id="Rectangle 1" o:spid="_x0000_s1026" style="position:absolute;margin-left:279.05pt;margin-top:11.4pt;width:179.05pt;height:171.1pt;z-index:251671552;visibility:visible;mso-wrap-style:square;mso-width-percent:0;mso-height-percent:0;mso-wrap-distance-left:9pt;mso-wrap-distance-top:0;mso-wrap-distance-right:9pt;mso-wrap-distance-bottom:0;mso-position-horizontal:absolute;mso-position-horizontal-relative:margin;mso-position-vertical:absolute;mso-position-vertical-relative:text;mso-width-percent:0;mso-height-percent:0;mso-width-relative:margin;mso-height-relative:margin;v-text-anchor:middle" o:gfxdata="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" stroked="f" strokeweight="1pt">
+                <v:fill r:id="rId16" o:title="" recolor="t" rotate="t" type="frame"/>
+                <w10:wrap anchorx="margin"/>
+              </v:rect>
+            </w:pict>
+          </mc:Fallback>
+        </mc:AlternateContent>
+      </w:r>
+      <w:r>
+        <w:rPr>
+          <w:noProof/>
+          <w:lang w:val="en-US"/>
+        </w:rPr>
+        <mc:AlternateContent>
+          <mc:Choice Requires="wps">
+            <w:drawing>
+              <wp:anchor distT="0" distB="0" distL="114300" distR="114300" simplePos="0" relativeHeight="251669504" behindDoc="0" locked="0" layoutInCell="1" allowOverlap="1" wp14:anchorId="7539B7C0" wp14:editId="1FE373C8">
+                <wp:simplePos x="0" y="0"/>
+                <wp:positionH relativeFrom="margin">
+                  <wp:posOffset>471054</wp:posOffset>
+                </wp:positionH>
+                <wp:positionV relativeFrom="paragraph">
+                  <wp:posOffset>151765</wp:posOffset>
+                </wp:positionV>
+                <wp:extent cx="2273935" cy="2172970"/>
+                <wp:effectExtent l="0" t="0" r="0" b="0"/>
+                <wp:wrapNone/>
+                <wp:docPr id="594329619" name="Rectangle 1"/>
+                <wp:cNvGraphicFramePr/>
+                <a:graphic xmlns:a="http://schemas.openxmlformats.org/drawingml/2006/main">
+                  <a:graphicData uri="http://schemas.microsoft.com/office/word/2010/wordprocessingShape">
+                    <wps:wsp>
+                      <wps:cNvSpPr/>
+                      <wps:spPr>
+                        <a:xfrm>
+                          <a:off x="0" y="0"/>
+                          <a:ext cx="2273935" cy="2172970"/>
+                        </a:xfrm>
+                        <a:prstGeom prst="rect">
+                          <a:avLst/>
+                        </a:prstGeom>
+                        <a:blipFill>
+                          <a:blip r:embed="rId17" cstate="print">
+                            <a:extLst>
+                              <a:ext uri="{28A0092B-C50C-407E-A947-70E740481C1C}">
+                                <a14:useLocalDpi xmlns:a14="http://schemas.microsoft.com/office/drawing/2010/main" val="0"/>
+                              </a:ext>
+                            </a:extLst>
+                          </a:blip>
+                          <a:stretch>
+                            <a:fillRect/>
+                          </a:stretch>
+                        </a:blipFill>
+                        <a:ln>
+                          <a:noFill/>
+                        </a:ln>
+                      </wps:spPr>
+                      <wps:style>
+                        <a:lnRef idx="2">
+                          <a:schemeClr val="accent1">
+                            <a:shade val="15000"/>
+                          </a:schemeClr>
+                        </a:lnRef>
+                        <a:fillRef idx="1">
+                          <a:schemeClr val="accent1"/>
+                        </a:fillRef>
+                        <a:effectRef idx="0">
+                          <a:schemeClr val="accent1"/>
+                        </a:effectRef>
+                        <a:fontRef idx="minor">
+                          <a:schemeClr val="lt1"/>
+                        </a:fontRef>
+                      </wps:style>
+                      <wps:bodyPr rot="0" spcFirstLastPara="0" vertOverflow="overflow" horzOverflow="overflow" vert="horz" wrap="square" lIns="91440" tIns="45720" rIns="91440" bIns="45720" numCol="1" spcCol="0" rtlCol="0" fromWordArt="0" anchor="ctr" anchorCtr="0" forceAA="0" compatLnSpc="1">
+                        <a:prstTxWarp prst="textNoShape">
+                          <a:avLst/>
+                        </a:prstTxWarp>
+                        <a:noAutofit/>
+                      </wps:bodyPr>
+                    </wps:wsp>
+                  </a:graphicData>
+                </a:graphic>
+                <wp14:sizeRelH relativeFrom="margin">
+                  <wp14:pctWidth>0</wp14:pctWidth>
+                </wp14:sizeRelH>
+                <wp14:sizeRelV relativeFrom="margin">
+                  <wp14:pctHeight>0</wp14:pctHeight>
+                </wp14:sizeRelV>
+              </wp:anchor>
+            </w:drawing>
+          </mc:Choice>
+          <mc:Fallback>
+            <w:pict>
+              <v:rect w14:anchorId="066C625A" id="Rectangle 1" o:spid="_x0000_s1026" style="position:absolute;margin-left:37.1pt;margin-top:11.95pt;width:179.05pt;height:171.1pt;z-index:251669504;visibility:visible;mso-wrap-style:square;mso-width-percent:0;mso-height-percent:0;mso-wrap-distance-left:9pt;mso-wrap-distance-top:0;mso-wrap-distance-right:9pt;mso-wrap-distance-bottom:0;mso-position-horizontal:absolute;mso-position-horizontal-relative:margin;mso-position-vertical:absolute;mso-position-vertical-relative:text;mso-width-percent:0;mso-height-percent:0;mso-width-relative:margin;mso-height-relative:margin;v-text-anchor:middle" o:gfxdata="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" stroked="f" strokeweight="1pt">
+                <v:fill r:id="rId18" o:title="" recolor="t" rotate="t" type="frame"/>
+                <w10:wrap anchorx="margin"/>
+              </v:rect>
+            </w:pict>
+          </mc:Fallback>
+        </mc:AlternateContent>
+      </w:r>
+    </w:p>
+    <w:p>
+      <w:pPr>
+        <w:rPr>
+          <w:sz w:val="18"/>
+          <w:szCs w:val="18"/>
+          <w:lang w:val="en-US"/>
+        </w:rPr>
+      </w:pPr>
+    </w:p>
+    <w:p>
+      <w:pPr>
+        <w:rPr>
+          <w:sz w:val="18"/>
+          <w:szCs w:val="18"/>
+          <w:lang w:val="en-US"/>
+        </w:rPr>
+      </w:pPr>
+    </w:p>
+    <w:p>
+      <w:pPr>
+        <w:rPr>
+          <w:sz w:val="18"/>
+          <w:szCs w:val="18"/>
+          <w:lang w:val="en-US"/>
+        </w:rPr>
+      </w:pPr>
+    </w:p>
+    <w:p>
+      <w:pPr>
+        <w:rPr>
+          <w:sz w:val="18"/>
+          <w:szCs w:val="18"/>
+          <w:lang w:val="en-US"/>
+        </w:rPr>
+      </w:pPr>
+    </w:p>
+    <w:p>
+      <w:pPr>
+        <w:rPr>
+          <w:sz w:val="18"/>
+          <w:szCs w:val="18"/>
+          <w:lang w:val="en-US"/>
+        </w:rPr>
+      </w:pPr>
+    </w:p>
+    <w:p>
+      <w:pPr>
+        <w:rPr>
+          <w:sz w:val="18"/>
+          <w:szCs w:val="18"/>
+          <w:lang w:val="en-US"/>
+        </w:rPr>
+      </w:pPr>
+    </w:p>
+    <w:p>
+      <w:pPr>
+        <w:rPr>
+          <w:sz w:val="18"/>
+          <w:szCs w:val="18"/>
+          <w:lang w:val="en-US"/>
+        </w:rPr>
+      </w:pPr>
+    </w:p>
+    <w:p>
+      <w:pPr>
+        <w:rPr>
+          <w:sz w:val="18"/>
+          <w:szCs w:val="18"/>
+          <w:lang w:val="en-US"/>
+        </w:rPr>
+      </w:pPr>
+    </w:p>
+    <w:p>
+      <w:pPr>
+        <w:rPr>
+          <w:sz w:val="18"/>
+          <w:szCs w:val="18"/>
+          <w:lang w:val="en-US"/>
+        </w:rPr>
+      </w:pPr>
+    </w:p>
+    <w:p>
+      <w:pPr>
+        <w:rPr>
+          <w:sz w:val="18"/>
+          <w:szCs w:val="18"/>
+          <w:lang w:val="en-US"/>
+        </w:rPr>
+      </w:pPr>
+      <w:r>
+        <w:rPr>
+          <w:sz w:val="18"/>
+          <w:szCs w:val="18"/>
+          <w:lang w:val="en-US"/>
+        </w:rPr>
+        <w:tab/>
+      </w:r>
+      <w:r>
+        <w:rPr>
+          <w:sz w:val="18"/>
+          <w:szCs w:val="18"/>
+          <w:lang w:val="en-US"/>
+        </w:rPr>
+        <w:tab/>
+        <w:t xml:space="preserve">Opening before quiescence                                                                      </w:t>
+      </w:r>
+      <w:r>
+        <w:rPr>
+          <w:sz w:val="18"/>
+          <w:szCs w:val="18"/>
+          <w:lang w:val="en-US"/>
+        </w:rPr>
+        <w:t xml:space="preserve"> </w:t>
+      </w:r>
+      <w:r>
+        <w:rPr>
+          <w:sz w:val="18"/>
+          <w:szCs w:val="18"/>
+          <w:lang w:val="en-US"/>
+        </w:rPr>
+        <w:t>Opening after quiescence</w:t>
+      </w:r>
+    </w:p>
+    <w:p>
+      <w:pPr>
+        <w:ind w:left="720"/>
+        <w:rPr>
+          <w:sz w:val="18"/>
+          <w:szCs w:val="18"/>
+          <w:lang w:val="en-US"/>
+        </w:rPr>
+      </w:pPr>
+      <w:r>
+        <w:rPr>
+          <w:sz w:val="18"/>
+          <w:szCs w:val="18"/>
+          <w:lang w:val="en-US"/>
+        </w:rPr>
+        <w:t xml:space="preserve">         (</w:t>
+      </w:r>
+      <w:r>
+        <w:rPr>
+          <w:sz w:val="18"/>
+          <w:szCs w:val="18"/>
+          <w:lang w:val="en-US"/>
+        </w:rPr>
+        <w:t>b1a3</w:t>
+      </w:r>
+      <w:r>
+        <w:rPr>
+          <w:sz w:val="18"/>
+          <w:szCs w:val="18"/>
+          <w:lang w:val="en-US"/>
+        </w:rPr>
+        <w:t>,</w:t>
+      </w:r>
+      <w:r>
+        <w:rPr>
+          <w:sz w:val="18"/>
+          <w:szCs w:val="18"/>
+          <w:lang w:val="en-US"/>
+        </w:rPr>
+        <w:t xml:space="preserve"> d7d5</w:t>
+      </w:r>
+      <w:r>
+        <w:rPr>
+          <w:sz w:val="18"/>
+          <w:szCs w:val="18"/>
+          <w:lang w:val="en-US"/>
+        </w:rPr>
+        <w:t>,</w:t>
+      </w:r>
+      <w:r>
+        <w:rPr>
+          <w:sz w:val="18"/>
+          <w:szCs w:val="18"/>
+          <w:lang w:val="en-US"/>
+        </w:rPr>
+        <w:t xml:space="preserve"> e2e3</w:t>
+      </w:r>
+      <w:r>
+        <w:rPr>
+          <w:sz w:val="18"/>
+          <w:szCs w:val="18"/>
+          <w:lang w:val="en-US"/>
+        </w:rPr>
+        <w:t>,</w:t>
+      </w:r>
+      <w:r>
+        <w:rPr>
+          <w:sz w:val="18"/>
+          <w:szCs w:val="18"/>
+          <w:lang w:val="en-US"/>
+        </w:rPr>
+        <w:t xml:space="preserve"> e7e5</w:t>
+      </w:r>
+      <w:r>
+        <w:rPr>
+          <w:sz w:val="18"/>
+          <w:szCs w:val="18"/>
+          <w:lang w:val="en-US"/>
+        </w:rPr>
+        <w:t>,</w:t>
+      </w:r>
+      <w:r>
+        <w:rPr>
+          <w:sz w:val="18"/>
+          <w:szCs w:val="18"/>
+          <w:lang w:val="en-US"/>
+        </w:rPr>
+        <w:t xml:space="preserve"> a3b5</w:t>
+      </w:r>
+      <w:r>
+        <w:rPr>
+          <w:sz w:val="18"/>
+          <w:szCs w:val="18"/>
+          <w:lang w:val="en-US"/>
+        </w:rPr>
+        <w:t>,</w:t>
+      </w:r>
+      <w:r>
+        <w:rPr>
+          <w:sz w:val="18"/>
+          <w:szCs w:val="18"/>
+          <w:lang w:val="en-US"/>
+        </w:rPr>
+        <w:t xml:space="preserve"> b8c6</w:t>
+      </w:r>
+      <w:r>
+        <w:rPr>
+          <w:sz w:val="18"/>
+          <w:szCs w:val="18"/>
+          <w:lang w:val="en-US"/>
+        </w:rPr>
+        <w:t>)                                                     (</w:t>
+      </w:r>
+      <w:r>
+        <w:rPr>
+          <w:sz w:val="18"/>
+          <w:szCs w:val="18"/>
+          <w:lang w:val="en-US"/>
+        </w:rPr>
+        <w:t>b1c3</w:t>
+      </w:r>
+      <w:r>
+        <w:rPr>
+          <w:sz w:val="18"/>
+          <w:szCs w:val="18"/>
+          <w:lang w:val="en-US"/>
+        </w:rPr>
+        <w:t>,</w:t>
+      </w:r>
+      <w:r>
+        <w:rPr>
+          <w:sz w:val="18"/>
+          <w:szCs w:val="18"/>
+          <w:lang w:val="en-US"/>
+        </w:rPr>
+        <w:t xml:space="preserve"> b8c6</w:t>
+      </w:r>
+      <w:r>
+        <w:rPr>
+          <w:sz w:val="18"/>
+          <w:szCs w:val="18"/>
+          <w:lang w:val="en-US"/>
+        </w:rPr>
+        <w:t>,</w:t>
+      </w:r>
+      <w:r>
+        <w:rPr>
+          <w:sz w:val="18"/>
+          <w:szCs w:val="18"/>
+          <w:lang w:val="en-US"/>
+        </w:rPr>
+        <w:t xml:space="preserve"> g1f3</w:t>
+      </w:r>
+      <w:r>
+        <w:rPr>
+          <w:sz w:val="18"/>
+          <w:szCs w:val="18"/>
+          <w:lang w:val="en-US"/>
+        </w:rPr>
+        <w:t>,</w:t>
+      </w:r>
+      <w:r>
+        <w:rPr>
+          <w:sz w:val="18"/>
+          <w:szCs w:val="18"/>
+          <w:lang w:val="en-US"/>
+        </w:rPr>
+        <w:t xml:space="preserve"> g8f6</w:t>
+      </w:r>
+      <w:r>
+        <w:rPr>
+          <w:sz w:val="18"/>
+          <w:szCs w:val="18"/>
+          <w:lang w:val="en-US"/>
+        </w:rPr>
+        <w:t>,</w:t>
+      </w:r>
+      <w:r>
+        <w:rPr>
+          <w:sz w:val="18"/>
+          <w:szCs w:val="18"/>
+          <w:lang w:val="en-US"/>
+        </w:rPr>
+        <w:t xml:space="preserve"> d2d4</w:t>
+      </w:r>
+      <w:r>
+        <w:rPr>
+          <w:sz w:val="18"/>
+          <w:szCs w:val="18"/>
+          <w:lang w:val="en-US"/>
+        </w:rPr>
+        <w:t>,</w:t>
+      </w:r>
+      <w:r>
+        <w:rPr>
+          <w:sz w:val="18"/>
+          <w:szCs w:val="18"/>
+          <w:lang w:val="en-US"/>
+        </w:rPr>
+        <w:t xml:space="preserve"> d7d5</w:t>
+      </w:r>
+      <w:r>
+        <w:rPr>
+          <w:sz w:val="18"/>
+          <w:szCs w:val="18"/>
+          <w:lang w:val="en-US"/>
+        </w:rPr>
+        <w:t>)</w:t>
+      </w:r>
+    </w:p>
+    <w:p>
+      <w:pPr>
+        <w:rPr>
+          <w:sz w:val="18"/>
+          <w:szCs w:val="18"/>
+          <w:lang w:val="en-US"/>
+        </w:rPr>
+      </w:pPr>
+    </w:p>
+    <w:p>
+      <w:pPr>
+        <w:pStyle w:val="ListParagraph"/>
+        <w:numPr>
+          <w:ilvl w:val="0"/>
+          <w:numId w:val="12"/>
+        </w:numPr>
+        <w:rPr>
+          <w:sz w:val="18"/>
+          <w:szCs w:val="18"/>
+          <w:lang w:val="en-US"/>
+        </w:rPr>
+      </w:pPr>
+      <w:r>
+        <w:rPr>
+          <w:sz w:val="18"/>
+          <w:szCs w:val="18"/>
+          <w:lang w:val="en-US"/>
+        </w:rPr>
+        <w:t>Quiescence search successfully reduced horizon effects by extending tactical capture sequences beyond the nominal search depth. This allowed the engine to correctly evaluate positions that required an additional ply of tactical calculation.</w:t>
+      </w:r>
+      <w:r>
+        <w:rPr>
+          <w:noProof/>
+          <w:lang w:val="en-US"/>
+        </w:rPr>
+        <w:t xml:space="preserve"> </w:t>
+      </w:r>
+    </w:p>
+    <w:p>
+      <w:pPr>
+        <w:ind w:left="360"/>
+        <w:rPr>
+          <w:sz w:val="18"/>
+          <w:szCs w:val="18"/>
+          <w:lang w:val="en-US"/>
+        </w:rPr>
+      </w:pPr>
+      <w:r>
+        <w:rPr>
+          <w:noProof/>
+          <w:lang w:val="en-US"/>
+        </w:rPr>
+        <mc:AlternateContent>
+          <mc:Choice Requires="wps">
+            <w:drawing>
+              <wp:anchor distT="0" distB="0" distL="114300" distR="114300" simplePos="0" relativeHeight="251673600" behindDoc="0" locked="0" layoutInCell="1" allowOverlap="1" wp14:anchorId="2A506F1B" wp14:editId="0B2B0D7A">
+                <wp:simplePos x="0" y="0"/>
+                <wp:positionH relativeFrom="column">
+                  <wp:posOffset>484909</wp:posOffset>
+                </wp:positionH>
+                <wp:positionV relativeFrom="paragraph">
+                  <wp:posOffset>10506</wp:posOffset>
+                </wp:positionV>
+                <wp:extent cx="2273935" cy="2192020"/>
+                <wp:effectExtent l="0" t="0" r="0" b="0"/>
+                <wp:wrapNone/>
+                <wp:docPr id="261328141" name="Rectangle 1"/>
+                <wp:cNvGraphicFramePr/>
+                <a:graphic xmlns:a="http://schemas.openxmlformats.org/drawingml/2006/main">
+                  <a:graphicData uri="http://schemas.microsoft.com/office/word/2010/wordprocessingShape">
+                    <wps:wsp>
+                      <wps:cNvSpPr/>
+                      <wps:spPr>
+                        <a:xfrm>
+                          <a:off x="0" y="0"/>
+                          <a:ext cx="2273935" cy="2192020"/>
+                        </a:xfrm>
+                        <a:prstGeom prst="rect">
+                          <a:avLst/>
+                        </a:prstGeom>
+                        <a:blipFill>
+                          <a:blip r:embed="rId9" cstate="print">
+                            <a:extLst>
+                              <a:ext uri="{28A0092B-C50C-407E-A947-70E740481C1C}">
+                                <a14:useLocalDpi xmlns:a14="http://schemas.microsoft.com/office/drawing/2010/main" val="0"/>
+                              </a:ext>
+                            </a:extLst>
+                          </a:blip>
+                          <a:stretch>
+                            <a:fillRect/>
+                          </a:stretch>
+                        </a:blipFill>
+                        <a:ln>
+                          <a:noFill/>
+                        </a:ln>
+                      </wps:spPr>
+                      <wps:style>
+                        <a:lnRef idx="2">
+                          <a:schemeClr val="accent1">
+                            <a:shade val="15000"/>
+                          </a:schemeClr>
+                        </a:lnRef>
+                        <a:fillRef idx="1">
+                          <a:schemeClr val="accent1"/>
+                        </a:fillRef>
+                        <a:effectRef idx="0">
+                          <a:schemeClr val="accent1"/>
+                        </a:effectRef>
+                        <a:fontRef idx="minor">
+                          <a:schemeClr val="lt1"/>
+                        </a:fontRef>
+                      </wps:style>
+                      <wps:bodyPr rot="0" spcFirstLastPara="0" vertOverflow="overflow" horzOverflow="overflow" vert="horz" wrap="square" lIns="91440" tIns="45720" rIns="91440" bIns="45720" numCol="1" spcCol="0" rtlCol="0" fromWordArt="0" anchor="ctr" anchorCtr="0" forceAA="0" compatLnSpc="1">
+                        <a:prstTxWarp prst="textNoShape">
+                          <a:avLst/>
+                        </a:prstTxWarp>
+                        <a:noAutofit/>
+                      </wps:bodyPr>
+                    </wps:wsp>
+                  </a:graphicData>
+                </a:graphic>
+                <wp14:sizeRelH relativeFrom="margin">
+                  <wp14:pctWidth>0</wp14:pctWidth>
+                </wp14:sizeRelH>
+                <wp14:sizeRelV relativeFrom="margin">
+                  <wp14:pctHeight>0</wp14:pctHeight>
+                </wp14:sizeRelV>
+              </wp:anchor>
+            </w:drawing>
+          </mc:Choice>
+          <mc:Fallback>
+            <w:pict>
+              <v:rect w14:anchorId="7BDA89D3" id="Rectangle 1" o:spid="_x0000_s1026" style="position:absolute;margin-left:38.2pt;margin-top:.85pt;width:179.05pt;height:172.6pt;z-index:251673600;visibility:visible;mso-wrap-style:square;mso-width-percent:0;mso-height-percent:0;mso-wrap-distance-left:9pt;mso-wrap-distance-top:0;mso-wrap-distance-right:9pt;mso-wrap-distance-bottom:0;mso-position-horizontal:absolute;mso-position-horizontal-relative:text;mso-position-vertical:absolute;mso-position-vertical-relative:text;mso-width-percent:0;mso-height-percent:0;mso-width-relative:margin;mso-height-relative:margin;v-text-anchor:middle" o:gfxdata="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" stroked="f" strokeweight="1pt">
+                <v:fill r:id="rId19" o:title="" recolor="t" rotate="t" type="frame"/>
+              </v:rect>
+            </w:pict>
+          </mc:Fallback>
+        </mc:AlternateContent>
+      </w:r>
+    </w:p>
+    <w:p>
+      <w:pPr>
+        <w:ind w:left="5040"/>
+        <w:rPr>
+          <w:sz w:val="18"/>
+          <w:szCs w:val="18"/>
+          <w:lang w:val="en-US"/>
+        </w:rPr>
+      </w:pPr>
+      <w:r>
+        <w:rPr>
+          <w:sz w:val="18"/>
+          <w:szCs w:val="18"/>
+          <w:lang w:val="en-US"/>
+        </w:rPr>
+        <w:t>Tactical sequence caught by quiescence search demonstrating reduction in horizon effect –        (Ra6a8, Qf8a8, Qc6a8)</w:t>
+      </w:r>
+    </w:p>
+    <w:p>
+      <w:pPr>
+        <w:rPr>
+          <w:sz w:val="18"/>
+          <w:szCs w:val="18"/>
+          <w:lang w:val="en-US"/>
+        </w:rPr>
+      </w:pPr>
+    </w:p>
+    <w:p>
+      <w:pPr>
+        <w:rPr>
+          <w:sz w:val="18"/>
+          <w:szCs w:val="18"/>
+          <w:lang w:val="en-US"/>
+        </w:rPr>
+      </w:pPr>
+    </w:p>
     <w:sectPr>
       <w:pgSz w:w="11906" w:h="16838"/>
       <w:pgMar w:top="1440" w:right="1440" w:bottom="1440" w:left="1440" w:header="708" w:footer="708" w:gutter="0"/>
@@ -4318,6 +5741,232 @@
 <file path=word/numbering.xml><?xml version="1.0" encoding="utf-8"?>
 <w:numbering xmlns:wpc="http://schemas.microsoft.com/office/word/2010/wordprocessingCanvas" xmlns:cx="http://schemas.microsoft.com/office/drawing/2014/chartex" xmlns:cx1="http://schemas.microsoft.com/office/drawing/2015/9/8/chartex" xmlns:cx2="http://schemas.microsoft.com/office/drawing/2015/10/21/chartex" xmlns:cx3="http://schemas.microsoft.com/office/drawing/2016/5/9/chartex" xmlns:cx4="http://schemas.microsoft.com/office/drawing/2016/5/10/chartex" xmlns:cx5="http://schemas.microsoft.com/office/drawing/2016/5/11/chartex" xmlns:cx6="http://schemas.microsoft.com/office/drawing/2016/5/12/chartex" xmlns:cx7="http://schemas.microsoft.com/office/drawing/2016/5/13/chartex" xmlns:cx8="http://schemas.microsoft.com/office/drawing/2016/5/14/chartex" xmlns:mc="http://schemas.openxmlformats.org/markup-compatibility/2006" xmlns:aink="http://schemas.microsoft.com/office/drawing/2016/ink" xmlns:am3d="http://schemas.microsoft.com/office/drawing/2017/model3d" xmlns:o="urn:schemas-microsoft-com:office:office" xmlns:oel="http://schemas.microsoft.com/office/2019/extlst" xmlns:r="http://schemas.openxmlformats.org/officeDocument/2006/relationships" xmlns:m="http://schemas.openxmlformats.org/officeDocument/2006/math" xmlns:v="urn:schemas-microsoft-com:vml" xmlns:wp14="http://schemas.microsoft.com/office/word/2010/wordprocessingDrawing" xmlns:wp="http://schemas.openxmlformats.org/drawingml/2006/wordprocessingDrawing" xmlns:w10="urn:schemas-microsoft-com:office:word" xmlns:w="http://schemas.openxmlformats.org/wordprocessingml/2006/main" xmlns:w14="http://schemas.microsoft.com/office/word/2010/wordml" xmlns:w15="http://schemas.microsoft.com/office/word/2012/wordml" xmlns:w16cex="http://schemas.microsoft.com/office/word/2018/wordml/cex" xmlns:w16cid="http://schemas.microsoft.com/office/word/2016/wordml/cid" xmlns:w16="http://schemas.microsoft.com/office/word/2018/wordml" xmlns:w16du="http://schemas.microsoft.com/office/word/2023/wordml/word16du" xmlns:w16sdtdh="http://schemas.microsoft.com/office/word/2020/wordml/sdtdatahash" xmlns:w16se="http://schemas.microsoft.com/office/word/2015/wordml/symex" xmlns:wpg="http://schemas.microsoft.com/office/word/2010/wordprocessingGroup" xmlns:wpi="http://schemas.microsoft.com/office/word/2010/wordprocessingInk" xmlns:wne="http://schemas.microsoft.com/office/word/2006/wordml" xmlns:wps="http://schemas.microsoft.com/office/word/2010/wordprocessingShape" mc:Ignorable="w14 w15 w16se w16cid w16 w16cex w16sdtdh w16du wp14">
   <w:abstractNum w:abstractNumId="0" w15:restartNumberingAfterBreak="0">
+    <w:nsid w:val="03784C6E"/>
+    <w:multiLevelType w:val="hybridMultilevel"/>
+    <w:tmpl w:val="985EFA18"/>
+    <w:lvl w:ilvl="0" w:tplc="40090001">
+      <w:start w:val="1"/>
+      <w:numFmt w:val="bullet"/>
+      <w:lvlText w:val=""/>
+      <w:lvlJc w:val="left"/>
+      <w:pPr>
+        <w:ind w:left="1440" w:hanging="360"/>
+      </w:pPr>
+      <w:rPr>
+        <w:rFonts w:ascii="Symbol" w:hAnsi="Symbol" w:hint="default"/>
+      </w:rPr>
+    </w:lvl>
+    <w:lvl w:ilvl="1" w:tplc="40090003" w:tentative="1">
+      <w:start w:val="1"/>
+      <w:numFmt w:val="bullet"/>
+      <w:lvlText w:val="o"/>
+      <w:lvlJc w:val="left"/>
+      <w:pPr>
+        <w:ind w:left="2160" w:hanging="360"/>
+      </w:pPr>
+      <w:rPr>
+        <w:rFonts w:ascii="Courier New" w:hAnsi="Courier New" w:cs="Courier New" w:hint="default"/>
+      </w:rPr>
+    </w:lvl>
+    <w:lvl w:ilvl="2" w:tplc="40090005" w:tentative="1">
+      <w:start w:val="1"/>
+      <w:numFmt w:val="bullet"/>
+      <w:lvlText w:val=""/>
+      <w:lvlJc w:val="left"/>
+      <w:pPr>
+        <w:ind w:left="2880" w:hanging="360"/>
+      </w:pPr>
+      <w:rPr>
+        <w:rFonts w:ascii="Wingdings" w:hAnsi="Wingdings" w:hint="default"/>
+      </w:rPr>
+    </w:lvl>
+    <w:lvl w:ilvl="3" w:tplc="40090001" w:tentative="1">
+      <w:start w:val="1"/>
+      <w:numFmt w:val="bullet"/>
+      <w:lvlText w:val=""/>
+      <w:lvlJc w:val="left"/>
+      <w:pPr>
+        <w:ind w:left="3600" w:hanging="360"/>
+      </w:pPr>
+      <w:rPr>
+        <w:rFonts w:ascii="Symbol" w:hAnsi="Symbol" w:hint="default"/>
+      </w:rPr>
+    </w:lvl>
+    <w:lvl w:ilvl="4" w:tplc="40090003" w:tentative="1">
+      <w:start w:val="1"/>
+      <w:numFmt w:val="bullet"/>
+      <w:lvlText w:val="o"/>
+      <w:lvlJc w:val="left"/>
+      <w:pPr>
+        <w:ind w:left="4320" w:hanging="360"/>
+      </w:pPr>
+      <w:rPr>
+        <w:rFonts w:ascii="Courier New" w:hAnsi="Courier New" w:cs="Courier New" w:hint="default"/>
+      </w:rPr>
+    </w:lvl>
+    <w:lvl w:ilvl="5" w:tplc="40090005" w:tentative="1">
+      <w:start w:val="1"/>
+      <w:numFmt w:val="bullet"/>
+      <w:lvlText w:val=""/>
+      <w:lvlJc w:val="left"/>
+      <w:pPr>
+        <w:ind w:left="5040" w:hanging="360"/>
+      </w:pPr>
+      <w:rPr>
+        <w:rFonts w:ascii="Wingdings" w:hAnsi="Wingdings" w:hint="default"/>
+      </w:rPr>
+    </w:lvl>
+    <w:lvl w:ilvl="6" w:tplc="40090001" w:tentative="1">
+      <w:start w:val="1"/>
+      <w:numFmt w:val="bullet"/>
+      <w:lvlText w:val=""/>
+      <w:lvlJc w:val="left"/>
+      <w:pPr>
+        <w:ind w:left="5760" w:hanging="360"/>
+      </w:pPr>
+      <w:rPr>
+        <w:rFonts w:ascii="Symbol" w:hAnsi="Symbol" w:hint="default"/>
+      </w:rPr>
+    </w:lvl>
+    <w:lvl w:ilvl="7" w:tplc="40090003" w:tentative="1">
+      <w:start w:val="1"/>
+      <w:numFmt w:val="bullet"/>
+      <w:lvlText w:val="o"/>
+      <w:lvlJc w:val="left"/>
+      <w:pPr>
+        <w:ind w:left="6480" w:hanging="360"/>
+      </w:pPr>
+      <w:rPr>
+        <w:rFonts w:ascii="Courier New" w:hAnsi="Courier New" w:cs="Courier New" w:hint="default"/>
+      </w:rPr>
+    </w:lvl>
+    <w:lvl w:ilvl="8" w:tplc="40090005" w:tentative="1">
+      <w:start w:val="1"/>
+      <w:numFmt w:val="bullet"/>
+      <w:lvlText w:val=""/>
+      <w:lvlJc w:val="left"/>
+      <w:pPr>
+        <w:ind w:left="7200" w:hanging="360"/>
+      </w:pPr>
+      <w:rPr>
+        <w:rFonts w:ascii="Wingdings" w:hAnsi="Wingdings" w:hint="default"/>
+      </w:rPr>
+    </w:lvl>
+  </w:abstractNum>
+  <w:abstractNum w:abstractNumId="1" w15:restartNumberingAfterBreak="0">
+    <w:nsid w:val="12FF0756"/>
+    <w:multiLevelType w:val="hybridMultilevel"/>
+    <w:tmpl w:val="348074F6"/>
+    <w:lvl w:ilvl="0" w:tplc="40090001">
+      <w:start w:val="1"/>
+      <w:numFmt w:val="bullet"/>
+      <w:lvlText w:val=""/>
+      <w:lvlJc w:val="left"/>
+      <w:pPr>
+        <w:ind w:left="720" w:hanging="360"/>
+      </w:pPr>
+      <w:rPr>
+        <w:rFonts w:ascii="Symbol" w:hAnsi="Symbol" w:hint="default"/>
+      </w:rPr>
+    </w:lvl>
+    <w:lvl w:ilvl="1" w:tplc="40090003" w:tentative="1">
+      <w:start w:val="1"/>
+      <w:numFmt w:val="bullet"/>
+      <w:lvlText w:val="o"/>
+      <w:lvlJc w:val="left"/>
+      <w:pPr>
+        <w:ind w:left="1440" w:hanging="360"/>
+      </w:pPr>
+      <w:rPr>
+        <w:rFonts w:ascii="Courier New" w:hAnsi="Courier New" w:cs="Courier New" w:hint="default"/>
+      </w:rPr>
+    </w:lvl>
+    <w:lvl w:ilvl="2" w:tplc="40090005" w:tentative="1">
+      <w:start w:val="1"/>
+      <w:numFmt w:val="bullet"/>
+      <w:lvlText w:val=""/>
+      <w:lvlJc w:val="left"/>
+      <w:pPr>
+        <w:ind w:left="2160" w:hanging="360"/>
+      </w:pPr>
+      <w:rPr>
+        <w:rFonts w:ascii="Wingdings" w:hAnsi="Wingdings" w:hint="default"/>
+      </w:rPr>
+    </w:lvl>
+    <w:lvl w:ilvl="3" w:tplc="40090001" w:tentative="1">
+      <w:start w:val="1"/>
+      <w:numFmt w:val="bullet"/>
+      <w:lvlText w:val=""/>
+      <w:lvlJc w:val="left"/>
+      <w:pPr>
+        <w:ind w:left="2880" w:hanging="360"/>
+      </w:pPr>
+      <w:rPr>
+        <w:rFonts w:ascii="Symbol" w:hAnsi="Symbol" w:hint="default"/>
+      </w:rPr>
+    </w:lvl>
+    <w:lvl w:ilvl="4" w:tplc="40090003" w:tentative="1">
+      <w:start w:val="1"/>
+      <w:numFmt w:val="bullet"/>
+      <w:lvlText w:val="o"/>
+      <w:lvlJc w:val="left"/>
+      <w:pPr>
+        <w:ind w:left="3600" w:hanging="360"/>
+      </w:pPr>
+      <w:rPr>
+        <w:rFonts w:ascii="Courier New" w:hAnsi="Courier New" w:cs="Courier New" w:hint="default"/>
+      </w:rPr>
+    </w:lvl>
+    <w:lvl w:ilvl="5" w:tplc="40090005" w:tentative="1">
+      <w:start w:val="1"/>
+      <w:numFmt w:val="bullet"/>
+      <w:lvlText w:val=""/>
+      <w:lvlJc w:val="left"/>
+      <w:pPr>
+        <w:ind w:left="4320" w:hanging="360"/>
+      </w:pPr>
+      <w:rPr>
+        <w:rFonts w:ascii="Wingdings" w:hAnsi="Wingdings" w:hint="default"/>
+      </w:rPr>
+    </w:lvl>
+    <w:lvl w:ilvl="6" w:tplc="40090001" w:tentative="1">
+      <w:start w:val="1"/>
+      <w:numFmt w:val="bullet"/>
+      <w:lvlText w:val=""/>
+      <w:lvlJc w:val="left"/>
+      <w:pPr>
+        <w:ind w:left="5040" w:hanging="360"/>
+      </w:pPr>
+      <w:rPr>
+        <w:rFonts w:ascii="Symbol" w:hAnsi="Symbol" w:hint="default"/>
+      </w:rPr>
+    </w:lvl>
+    <w:lvl w:ilvl="7" w:tplc="40090003" w:tentative="1">
+      <w:start w:val="1"/>
+      <w:numFmt w:val="bullet"/>
+      <w:lvlText w:val="o"/>
+      <w:lvlJc w:val="left"/>
+      <w:pPr>
+        <w:ind w:left="5760" w:hanging="360"/>
+      </w:pPr>
+      <w:rPr>
+        <w:rFonts w:ascii="Courier New" w:hAnsi="Courier New" w:cs="Courier New" w:hint="default"/>
+      </w:rPr>
+    </w:lvl>
+    <w:lvl w:ilvl="8" w:tplc="40090005" w:tentative="1">
+      <w:start w:val="1"/>
+      <w:numFmt w:val="bullet"/>
+      <w:lvlText w:val=""/>
+      <w:lvlJc w:val="left"/>
+      <w:pPr>
+        <w:ind w:left="6480" w:hanging="360"/>
+      </w:pPr>
+      <w:rPr>
+        <w:rFonts w:ascii="Wingdings" w:hAnsi="Wingdings" w:hint="default"/>
+      </w:rPr>
+    </w:lvl>
+  </w:abstractNum>
+  <w:abstractNum w:abstractNumId="2" w15:restartNumberingAfterBreak="0">
     <w:nsid w:val="14066A6D"/>
     <w:multiLevelType w:val="hybridMultilevel"/>
     <w:tmpl w:val="7FD80B94"/>
@@ -4432,7 +6081,7 @@
       </w:rPr>
     </w:lvl>
   </w:abstractNum>
-  <w:abstractNum w:abstractNumId="1" w15:restartNumberingAfterBreak="0">
+  <w:abstractNum w:abstractNumId="3" w15:restartNumberingAfterBreak="0">
     <w:nsid w:val="1C0F1852"/>
     <w:multiLevelType w:val="multilevel"/>
     <w:tmpl w:val="79E0FA14"/>
@@ -4581,7 +6230,7 @@
       </w:rPr>
     </w:lvl>
   </w:abstractNum>
-  <w:abstractNum w:abstractNumId="2" w15:restartNumberingAfterBreak="0">
+  <w:abstractNum w:abstractNumId="4" w15:restartNumberingAfterBreak="0">
     <w:nsid w:val="28FB640F"/>
     <w:multiLevelType w:val="hybridMultilevel"/>
     <w:tmpl w:val="B8F8B052"/>
@@ -4696,7 +6345,7 @@
       </w:rPr>
     </w:lvl>
   </w:abstractNum>
-  <w:abstractNum w:abstractNumId="3" w15:restartNumberingAfterBreak="0">
+  <w:abstractNum w:abstractNumId="5" w15:restartNumberingAfterBreak="0">
     <w:nsid w:val="2BE05B12"/>
     <w:multiLevelType w:val="hybridMultilevel"/>
     <w:tmpl w:val="78D4E05A"/>
@@ -4785,7 +6434,7 @@
       </w:pPr>
     </w:lvl>
   </w:abstractNum>
-  <w:abstractNum w:abstractNumId="4" w15:restartNumberingAfterBreak="0">
+  <w:abstractNum w:abstractNumId="6" w15:restartNumberingAfterBreak="0">
     <w:nsid w:val="41201E69"/>
     <w:multiLevelType w:val="multilevel"/>
     <w:tmpl w:val="B71AF922"/>
@@ -4934,7 +6583,7 @@
       </w:rPr>
     </w:lvl>
   </w:abstractNum>
-  <w:abstractNum w:abstractNumId="5" w15:restartNumberingAfterBreak="0">
+  <w:abstractNum w:abstractNumId="7" w15:restartNumberingAfterBreak="0">
     <w:nsid w:val="65441C26"/>
     <w:multiLevelType w:val="hybridMultilevel"/>
     <w:tmpl w:val="831C6E54"/>
@@ -5023,7 +6672,7 @@
       </w:pPr>
     </w:lvl>
   </w:abstractNum>
-  <w:abstractNum w:abstractNumId="6" w15:restartNumberingAfterBreak="0">
+  <w:abstractNum w:abstractNumId="8" w15:restartNumberingAfterBreak="0">
     <w:nsid w:val="6C53764C"/>
     <w:multiLevelType w:val="multilevel"/>
     <w:tmpl w:val="47A01330"/>
@@ -5172,7 +6821,7 @@
       </w:rPr>
     </w:lvl>
   </w:abstractNum>
-  <w:abstractNum w:abstractNumId="7" w15:restartNumberingAfterBreak="0">
+  <w:abstractNum w:abstractNumId="9" w15:restartNumberingAfterBreak="0">
     <w:nsid w:val="6D5B0677"/>
     <w:multiLevelType w:val="multilevel"/>
     <w:tmpl w:val="5F56C992"/>
@@ -5321,7 +6970,120 @@
       </w:rPr>
     </w:lvl>
   </w:abstractNum>
-  <w:abstractNum w:abstractNumId="8" w15:restartNumberingAfterBreak="0">
+  <w:abstractNum w:abstractNumId="10" w15:restartNumberingAfterBreak="0">
+    <w:nsid w:val="77710BE0"/>
+    <w:multiLevelType w:val="hybridMultilevel"/>
+    <w:tmpl w:val="96F844D0"/>
+    <w:lvl w:ilvl="0" w:tplc="40090001">
+      <w:start w:val="1"/>
+      <w:numFmt w:val="bullet"/>
+      <w:lvlText w:val=""/>
+      <w:lvlJc w:val="left"/>
+      <w:pPr>
+        <w:ind w:left="720" w:hanging="360"/>
+      </w:pPr>
+      <w:rPr>
+        <w:rFonts w:ascii="Symbol" w:hAnsi="Symbol" w:hint="default"/>
+      </w:rPr>
+    </w:lvl>
+    <w:lvl w:ilvl="1" w:tplc="40090003">
+      <w:start w:val="1"/>
+      <w:numFmt w:val="bullet"/>
+      <w:lvlText w:val="o"/>
+      <w:lvlJc w:val="left"/>
+      <w:pPr>
+        <w:ind w:left="1440" w:hanging="360"/>
+      </w:pPr>
+      <w:rPr>
+        <w:rFonts w:ascii="Courier New" w:hAnsi="Courier New" w:cs="Courier New" w:hint="default"/>
+      </w:rPr>
+    </w:lvl>
+    <w:lvl w:ilvl="2" w:tplc="40090005" w:tentative="1">
+      <w:start w:val="1"/>
+      <w:numFmt w:val="bullet"/>
+      <w:lvlText w:val=""/>
+      <w:lvlJc w:val="left"/>
+      <w:pPr>
+        <w:ind w:left="2160" w:hanging="360"/>
+      </w:pPr>
+      <w:rPr>
+        <w:rFonts w:ascii="Wingdings" w:hAnsi="Wingdings" w:hint="default"/>
+      </w:rPr>
+    </w:lvl>
+    <w:lvl w:ilvl="3" w:tplc="40090001" w:tentative="1">
+      <w:start w:val="1"/>
+      <w:numFmt w:val="bullet"/>
+      <w:lvlText w:val=""/>
+      <w:lvlJc w:val="left"/>
+      <w:pPr>
+        <w:ind w:left="2880" w:hanging="360"/>
+      </w:pPr>
+      <w:rPr>
+        <w:rFonts w:ascii="Symbol" w:hAnsi="Symbol" w:hint="default"/>
+      </w:rPr>
+    </w:lvl>
+    <w:lvl w:ilvl="4" w:tplc="40090003" w:tentative="1">
+      <w:start w:val="1"/>
+      <w:numFmt w:val="bullet"/>
+      <w:lvlText w:val="o"/>
+      <w:lvlJc w:val="left"/>
+      <w:pPr>
+        <w:ind w:left="3600" w:hanging="360"/>
+      </w:pPr>
+      <w:rPr>
+        <w:rFonts w:ascii="Courier New" w:hAnsi="Courier New" w:cs="Courier New" w:hint="default"/>
+      </w:rPr>
+    </w:lvl>
+    <w:lvl w:ilvl="5" w:tplc="40090005" w:tentative="1">
+      <w:start w:val="1"/>
+      <w:numFmt w:val="bullet"/>
+      <w:lvlText w:val=""/>
+      <w:lvlJc w:val="left"/>
+      <w:pPr>
+        <w:ind w:left="4320" w:hanging="360"/>
+      </w:pPr>
+      <w:rPr>
+        <w:rFonts w:ascii="Wingdings" w:hAnsi="Wingdings" w:hint="default"/>
+      </w:rPr>
+    </w:lvl>
+    <w:lvl w:ilvl="6" w:tplc="40090001" w:tentative="1">
+      <w:start w:val="1"/>
+      <w:numFmt w:val="bullet"/>
+      <w:lvlText w:val=""/>
+      <w:lvlJc w:val="left"/>
+      <w:pPr>
+        <w:ind w:left="5040" w:hanging="360"/>
+      </w:pPr>
+      <w:rPr>
+        <w:rFonts w:ascii="Symbol" w:hAnsi="Symbol" w:hint="default"/>
+      </w:rPr>
+    </w:lvl>
+    <w:lvl w:ilvl="7" w:tplc="40090003" w:tentative="1">
+      <w:start w:val="1"/>
+      <w:numFmt w:val="bullet"/>
+      <w:lvlText w:val="o"/>
+      <w:lvlJc w:val="left"/>
+      <w:pPr>
+        <w:ind w:left="5760" w:hanging="360"/>
+      </w:pPr>
+      <w:rPr>
+        <w:rFonts w:ascii="Courier New" w:hAnsi="Courier New" w:cs="Courier New" w:hint="default"/>
+      </w:rPr>
+    </w:lvl>
+    <w:lvl w:ilvl="8" w:tplc="40090005" w:tentative="1">
+      <w:start w:val="1"/>
+      <w:numFmt w:val="bullet"/>
+      <w:lvlText w:val=""/>
+      <w:lvlJc w:val="left"/>
+      <w:pPr>
+        <w:ind w:left="6480" w:hanging="360"/>
+      </w:pPr>
+      <w:rPr>
+        <w:rFonts w:ascii="Wingdings" w:hAnsi="Wingdings" w:hint="default"/>
+      </w:rPr>
+    </w:lvl>
+  </w:abstractNum>
+  <w:abstractNum w:abstractNumId="11" w15:restartNumberingAfterBreak="0">
     <w:nsid w:val="7C150684"/>
     <w:multiLevelType w:val="multilevel"/>
     <w:tmpl w:val="466276DA"/>
@@ -5471,31 +7233,40 @@
     </w:lvl>
   </w:abstractNum>
   <w:num w:numId="1" w16cid:durableId="1918008032">
+    <w:abstractNumId w:val="7"/>
+  </w:num>
+  <w:num w:numId="2" w16cid:durableId="1736316788">
     <w:abstractNumId w:val="5"/>
   </w:num>
-  <w:num w:numId="2" w16cid:durableId="1736316788">
+  <w:num w:numId="3" w16cid:durableId="1231237616">
+    <w:abstractNumId w:val="2"/>
+  </w:num>
+  <w:num w:numId="4" w16cid:durableId="692732249">
+    <w:abstractNumId w:val="4"/>
+  </w:num>
+  <w:num w:numId="5" w16cid:durableId="1347050104">
+    <w:abstractNumId w:val="8"/>
+  </w:num>
+  <w:num w:numId="6" w16cid:durableId="1323775650">
+    <w:abstractNumId w:val="9"/>
+  </w:num>
+  <w:num w:numId="7" w16cid:durableId="1010063160">
     <w:abstractNumId w:val="3"/>
   </w:num>
-  <w:num w:numId="3" w16cid:durableId="1231237616">
+  <w:num w:numId="8" w16cid:durableId="174543059">
+    <w:abstractNumId w:val="6"/>
+  </w:num>
+  <w:num w:numId="9" w16cid:durableId="2143887793">
+    <w:abstractNumId w:val="11"/>
+  </w:num>
+  <w:num w:numId="10" w16cid:durableId="775103206">
+    <w:abstractNumId w:val="1"/>
+  </w:num>
+  <w:num w:numId="11" w16cid:durableId="1647467038">
     <w:abstractNumId w:val="0"/>
   </w:num>
-  <w:num w:numId="4" w16cid:durableId="692732249">
-    <w:abstractNumId w:val="2"/>
-  </w:num>
-  <w:num w:numId="5" w16cid:durableId="1347050104">
-    <w:abstractNumId w:val="6"/>
-  </w:num>
-  <w:num w:numId="6" w16cid:durableId="1323775650">
-    <w:abstractNumId w:val="7"/>
-  </w:num>
-  <w:num w:numId="7" w16cid:durableId="1010063160">
-    <w:abstractNumId w:val="1"/>
-  </w:num>
-  <w:num w:numId="8" w16cid:durableId="174543059">
-    <w:abstractNumId w:val="4"/>
-  </w:num>
-  <w:num w:numId="9" w16cid:durableId="2143887793">
-    <w:abstractNumId w:val="8"/>
+  <w:num w:numId="12" w16cid:durableId="190653458">
+    <w:abstractNumId w:val="10"/>
   </w:num>
 </w:numbering>
 </file>
@@ -5904,6 +7675,7 @@
   <w:style w:type="character" w:default="1" w:styleId="DefaultParagraphFont">
     <w:name w:val="Default Paragraph Font"/>
     <w:uiPriority w:val="1"/>
+    <w:semiHidden/>
     <w:unhideWhenUsed/>
   </w:style>
   <w:style w:type="table" w:default="1" w:styleId="TableNormal">

</xml_diff>